<commit_message>
Polish drug-loft tender secondary docs
Templatize the remaining dynamic values in the secondary tender documents:
the date in REFERENCE / BID FORM 3 / GENERAL REQUIREMENT / WARRANTY, the item
in REFERENCE, and the date + consignee address + title in the Manufacturer's
Authorization. Wire the technical-specification page-header title; its body
(per-product spec content) stays static.

Audit now shows no leftover hardcoded sample values; all docs render clean.

Co-Authored-By: Claude Opus 4.8 <noreply@anthropic.com>
</commit_message>
<xml_diff>
--- a/public/templates/drug-loft/tender/BID FORM 3.docx
+++ b/public/templates/drug-loft/tender/BID FORM 3.docx
@@ -661,20 +661,20 @@
         <w:rPr>
           <w:rFonts w:ascii="Candara" w:hAnsi="Candara"/>
         </w:rPr>
-        <w:t>2</w:t>
+        <w:t>{{dateDay}}</w:t>
       </w:r>
       <w:r>
         <w:rPr>
           <w:rFonts w:ascii="Candara" w:hAnsi="Candara"/>
         </w:rPr>
-        <w:t>4</w:t>
+        <w:t/>
       </w:r>
       <w:r>
         <w:rPr>
           <w:rFonts w:ascii="Candara" w:hAnsi="Candara"/>
           <w:vertAlign w:val="superscript"/>
         </w:rPr>
-        <w:t>th</w:t>
+        <w:t>{{daySuffix}}</w:t>
       </w:r>
       <w:r>
         <w:rPr>
@@ -686,13 +686,13 @@
         <w:rPr>
           <w:rFonts w:ascii="Candara" w:hAnsi="Candara"/>
         </w:rPr>
-        <w:t>November</w:t>
+        <w:t>{{dateMonth}}</w:t>
       </w:r>
       <w:r>
         <w:rPr>
           <w:rFonts w:ascii="Candara" w:hAnsi="Candara"/>
         </w:rPr>
-        <w:t>, 2022</w:t>
+        <w:t>, {{dateYear}}</w:t>
       </w:r>
       <w:r>
         <w:rPr>

</xml_diff>